<commit_message>
docs(E5): el paquete de banco pasa a ca2de3d - 226ae26 y 622a20b se retiran sin mandarse
Encargo (.md y .docx, 43 huecos contados en los dos) y LEEME re-apuntados:
Maestro 317f8e46 (42228 B), Esclavo 3884e6af (36532 B) -recompilados desde cero
dos veces con el mismo sha256-, ESP32 171ceb3c sin cambios, APK 811f6399 de
622a20b (la app no cambio). La prueba D usa la respuesta nueva de REINICIAR_RELOJ
para saber si el cristal cuenta. Cifras del acta: 18 PASS, 1 FALLA (D-22), banco
1416/1417, Degradado 71/71, flash 64.0/55.3. Retira: los hashes de 226ae26.

Co-Authored-By: Claude Opus 5 (1M context) <noreply@anthropic.com>
</commit_message>
<xml_diff>
--- a/05_Funcional/ENCARGO_BANCO_15-09.docx
+++ b/05_Funcional/ENCARGO_BANCO_15-09.docx
@@ -21,7 +21,7 @@
           <w:color w:val="003366"/>
           <w:sz w:val="32"/>
         </w:rPr>
-        <w:t>226ae26</w:t>
+        <w:t>ca2de3d</w:t>
       </w:r>
     </w:p>
     <w:p>
@@ -701,11 +701,11 @@
           <w:rFonts w:ascii="Consolas" w:hAnsi="Consolas"/>
           <w:sz w:val="18"/>
         </w:rPr>
-        <w:t>STM32_Programmer_CLI -c port=SWD mode=UR -e all -w Maestro_2026-09-15_226ae26_SIN_BANCO.bin 0x08000000 -v -rst</w:t>
+        <w:t>STM32_Programmer_CLI -c port=SWD mode=UR -e all -w Maestro_2026-09-15_ca2de3d_SIN_BANCO.bin 0x08000000 -v -rst</w:t>
         <w:br/>
-        <w:t>STM32_Programmer_CLI -c port=SWD mode=UR -u 0x08000000 41644 leido_maestro.bin</w:t>
+        <w:t>STM32_Programmer_CLI -c port=SWD mode=UR -u 0x08000000 42228 leido_maestro.bin</w:t>
         <w:br/>
-        <w:t>sha256sum leido_maestro.bin      (y lo mismo con el Esclavo: 36408 B)</w:t>
+        <w:t>sha256sum leido_maestro.bin      (y lo mismo con el Esclavo: 36532 B)</w:t>
       </w:r>
     </w:p>
     <w:p>
@@ -854,14 +854,14 @@
           <w:rFonts w:ascii="Consolas" w:hAnsi="Consolas"/>
           <w:sz w:val="21"/>
         </w:rPr>
-        <w:t>Maestro_2026-09-15_226ae26_SIN_BANCO.bin</w:t>
-      </w:r>
-      <w:r>
-        <w:rPr>
-          <w:b w:val="0"/>
-          <w:sz w:val="21"/>
-        </w:rPr>
-        <w:t xml:space="preserve"> · 41644 B · sha256</w:t>
+        <w:t>Maestro_2026-09-15_ca2de3d_SIN_BANCO.bin</w:t>
+      </w:r>
+      <w:r>
+        <w:rPr>
+          <w:b w:val="0"/>
+          <w:sz w:val="21"/>
+        </w:rPr>
+        <w:t xml:space="preserve"> · 42228 B · sha256</w:t>
       </w:r>
     </w:p>
     <w:p>
@@ -873,7 +873,7 @@
           <w:rFonts w:ascii="Consolas" w:hAnsi="Consolas"/>
           <w:sz w:val="21"/>
         </w:rPr>
-        <w:t>19dc60559f2a9b2b5fbf66b6847aa41b5eaf48401d4fd3533a0cbb56f1031f72</w:t>
+        <w:t>317f8e463cb461413594148102e2f670e12f922d029a23ce12de66f1593157f4</w:t>
       </w:r>
     </w:p>
     <w:p>
@@ -894,14 +894,14 @@
           <w:rFonts w:ascii="Consolas" w:hAnsi="Consolas"/>
           <w:sz w:val="21"/>
         </w:rPr>
-        <w:t>Esclavo_2026-09-15_226ae26_SIN_BANCO.bin</w:t>
-      </w:r>
-      <w:r>
-        <w:rPr>
-          <w:b w:val="0"/>
-          <w:sz w:val="21"/>
-        </w:rPr>
-        <w:t xml:space="preserve"> · 36408 B · sha256</w:t>
+        <w:t>Esclavo_2026-09-15_ca2de3d_SIN_BANCO.bin</w:t>
+      </w:r>
+      <w:r>
+        <w:rPr>
+          <w:b w:val="0"/>
+          <w:sz w:val="21"/>
+        </w:rPr>
+        <w:t xml:space="preserve"> · 36532 B · sha256</w:t>
       </w:r>
     </w:p>
     <w:p>
@@ -913,7 +913,7 @@
           <w:rFonts w:ascii="Consolas" w:hAnsi="Consolas"/>
           <w:sz w:val="21"/>
         </w:rPr>
-        <w:t>39dd40ca28216e0317a2ff95d50ce5f2ca62862c062ad2569d4300c705cb6c99</w:t>
+        <w:t>3884e6afaf75d38338f9be183332f1aa8673c24788928d22069e47afd3773434</w:t>
       </w:r>
     </w:p>
     <w:p>
@@ -934,14 +934,14 @@
           <w:rFonts w:ascii="Consolas" w:hAnsi="Consolas"/>
           <w:sz w:val="21"/>
         </w:rPr>
-        <w:t>IOT_VIAL_Semaforos_2026-09-15_226ae26_SIN_BANCO.apk</w:t>
-      </w:r>
-      <w:r>
-        <w:rPr>
-          <w:b w:val="0"/>
-          <w:sz w:val="21"/>
-        </w:rPr>
-        <w:t xml:space="preserve"> · 4.019.775 B · sha256</w:t>
+        <w:t>IOT_VIAL_Semaforos_2026-09-15_622a20b_SIN_BANCO.apk</w:t>
+      </w:r>
+      <w:r>
+        <w:rPr>
+          <w:b w:val="0"/>
+          <w:sz w:val="21"/>
+        </w:rPr>
+        <w:t xml:space="preserve"> · 4.020.773 B · sha256</w:t>
       </w:r>
     </w:p>
     <w:p>
@@ -953,7 +953,7 @@
           <w:rFonts w:ascii="Consolas" w:hAnsi="Consolas"/>
           <w:sz w:val="21"/>
         </w:rPr>
-        <w:t>6afaa466d7f3334d2020830b3d73062307f5ec06f502bf642fdc0b4cd6ca3b1e</w:t>
+        <w:t>811f6399555f02fa0e53fe8bd74038013be5a7d0fefbfff5fd58593eb3f03688</w:t>
       </w:r>
     </w:p>
     <w:p>
@@ -967,6 +967,60 @@
           <w:b w:val="0"/>
           <w:sz w:val="21"/>
         </w:rPr>
+        <w:t>La APK lleva el nombre del commit del que salio (</w:t>
+      </w:r>
+      <w:r>
+        <w:rPr>
+          <w:rFonts w:ascii="Consolas" w:hAnsi="Consolas"/>
+          <w:sz w:val="21"/>
+        </w:rPr>
+        <w:t>622a20b</w:t>
+      </w:r>
+      <w:r>
+        <w:rPr>
+          <w:b w:val="0"/>
+          <w:sz w:val="21"/>
+        </w:rPr>
+        <w:t>): la app no cambio despues</w:t>
+      </w:r>
+    </w:p>
+    <w:p>
+      <w:pPr>
+        <w:spacing w:after="120"/>
+      </w:pPr>
+      <w:r>
+        <w:rPr>
+          <w:b w:val="0"/>
+          <w:sz w:val="21"/>
+        </w:rPr>
+        <w:t>(</w:t>
+      </w:r>
+      <w:r>
+        <w:rPr>
+          <w:rFonts w:ascii="Consolas" w:hAnsi="Consolas"/>
+          <w:sz w:val="21"/>
+        </w:rPr>
+        <w:t>git diff --name-only 622a20b..ca2de3d -- 05_Funcional/App_Semaforo</w:t>
+      </w:r>
+      <w:r>
+        <w:rPr>
+          <w:b w:val="0"/>
+          <w:sz w:val="21"/>
+        </w:rPr>
+        <w:t xml:space="preserve"> sale vacio).</w:t>
+      </w:r>
+    </w:p>
+    <w:p>
+      <w:pPr>
+        <w:pStyle w:val="ListBullet"/>
+        <w:spacing w:after="60"/>
+        <w:ind w:left="720"/>
+      </w:pPr>
+      <w:r>
+        <w:rPr>
+          <w:b w:val="0"/>
+          <w:sz w:val="21"/>
+        </w:rPr>
         <w:t>Se verifica ESTE fichero: recompilada en otro PC, la misma APK puede dar otro sha256 (finales de linea).</w:t>
       </w:r>
     </w:p>
@@ -988,7 +1042,7 @@
           <w:rFonts w:ascii="Consolas" w:hAnsi="Consolas"/>
           <w:sz w:val="21"/>
         </w:rPr>
-        <w:t>ESP32_Expansion_2026-09-15_226ae26_SIN_BANCO.bin</w:t>
+        <w:t>ESP32_Expansion_2026-09-15_ca2de3d_SIN_BANCO.bin</w:t>
       </w:r>
       <w:r>
         <w:rPr>
@@ -1082,7 +1136,7 @@
           <w:rFonts w:ascii="Consolas" w:hAnsi="Consolas"/>
           <w:sz w:val="21"/>
         </w:rPr>
-        <w:t>Paquete_Banco_2026-09-15_226ae26_SIN_BANCO.zip</w:t>
+        <w:t>Paquete_Banco_2026-09-15_ca2de3d_SIN_BANCO.zip</w:t>
       </w:r>
       <w:r>
         <w:rPr>
@@ -1168,7 +1222,7 @@
           <w:b/>
           <w:sz w:val="21"/>
         </w:rPr>
-        <w:t>1409/1410</w:t>
+        <w:t>1416/1417</w:t>
       </w:r>
       <w:r>
         <w:rPr>
@@ -1182,21 +1236,40 @@
           <w:b/>
           <w:sz w:val="21"/>
         </w:rPr>
-        <w:t>120/120</w:t>
-      </w:r>
-      <w:r>
-        <w:rPr>
-          <w:b w:val="0"/>
-          <w:sz w:val="21"/>
-        </w:rPr>
-        <w:t xml:space="preserve">; flash Maestro </w:t>
+        <w:t>122/122</w:t>
+      </w:r>
+      <w:r>
+        <w:rPr>
+          <w:b w:val="0"/>
+          <w:sz w:val="21"/>
+        </w:rPr>
+        <w:t xml:space="preserve">; Degradado a dos puntas </w:t>
       </w:r>
       <w:r>
         <w:rPr>
           <w:b/>
           <w:sz w:val="21"/>
         </w:rPr>
-        <w:t>63.1 %</w:t>
+        <w:t>71/71</w:t>
+      </w:r>
+      <w:r>
+        <w:rPr>
+          <w:b w:val="0"/>
+          <w:sz w:val="21"/>
+        </w:rPr>
+        <w:t>; flash Maestro</w:t>
+      </w:r>
+    </w:p>
+    <w:p>
+      <w:pPr>
+        <w:spacing w:after="120"/>
+      </w:pPr>
+      <w:r>
+        <w:rPr>
+          <w:b/>
+          <w:sz w:val="21"/>
+        </w:rPr>
+        <w:t>64.0 %</w:t>
       </w:r>
       <w:r>
         <w:rPr>
@@ -1210,7 +1283,7 @@
           <w:b/>
           <w:sz w:val="21"/>
         </w:rPr>
-        <w:t>55.1 %</w:t>
+        <w:t>55.3 %</w:t>
       </w:r>
       <w:r>
         <w:rPr>
@@ -1327,63 +1400,35 @@
           <w:b w:val="0"/>
           <w:sz w:val="21"/>
         </w:rPr>
-        <w:t xml:space="preserve">El acta se tomo con </w:t>
+        <w:t xml:space="preserve">El acta se tomo con el arreglo </w:t>
       </w:r>
       <w:r>
         <w:rPr>
           <w:rFonts w:ascii="Consolas" w:hAnsi="Consolas"/>
           <w:sz w:val="21"/>
         </w:rPr>
-        <w:t>HEAD</w:t>
-      </w:r>
-      <w:r>
-        <w:rPr>
-          <w:b w:val="0"/>
-          <w:sz w:val="21"/>
-        </w:rPr>
-        <w:t xml:space="preserve"> en </w:t>
+        <w:t>1.49b3</w:t>
+      </w:r>
+      <w:r>
+        <w:rPr>
+          <w:b w:val="0"/>
+          <w:sz w:val="21"/>
+        </w:rPr>
+        <w:t xml:space="preserve"> integrado justo antes de comitearlo como </w:t>
       </w:r>
       <w:r>
         <w:rPr>
           <w:rFonts w:ascii="Consolas" w:hAnsi="Consolas"/>
           <w:sz w:val="21"/>
         </w:rPr>
-        <w:t>457ae81</w:t>
-      </w:r>
-      <w:r>
-        <w:rPr>
-          <w:b w:val="0"/>
-          <w:sz w:val="21"/>
-        </w:rPr>
-        <w:t xml:space="preserve"> y los cambios de </w:t>
-      </w:r>
-      <w:r>
-        <w:rPr>
-          <w:rFonts w:ascii="Consolas" w:hAnsi="Consolas"/>
-          <w:sz w:val="21"/>
-        </w:rPr>
-        <w:t>D-34</w:t>
-      </w:r>
-      <w:r>
-        <w:rPr>
-          <w:b w:val="0"/>
-          <w:sz w:val="21"/>
-        </w:rPr>
-        <w:t xml:space="preserve"> sin comitear: no hay acta con </w:t>
-      </w:r>
-      <w:r>
-        <w:rPr>
-          <w:rFonts w:ascii="Consolas" w:hAnsi="Consolas"/>
-          <w:sz w:val="21"/>
-        </w:rPr>
-        <w:t>HEAD</w:t>
-      </w:r>
-      <w:r>
-        <w:rPr>
-          <w:b w:val="0"/>
-          <w:sz w:val="21"/>
-        </w:rPr>
-        <w:t xml:space="preserve"> en</w:t>
+        <w:t>ca2de3d</w:t>
+      </w:r>
+      <w:r>
+        <w:rPr>
+          <w:b w:val="0"/>
+          <w:sz w:val="21"/>
+        </w:rPr>
+        <w:t>: el fuente medido</w:t>
       </w:r>
     </w:p>
     <w:p>
@@ -1392,10 +1437,17 @@
       </w:pPr>
       <w:r>
         <w:rPr>
+          <w:b w:val="0"/>
+          <w:sz w:val="21"/>
+        </w:rPr>
+        <w:t xml:space="preserve">es el de </w:t>
+      </w:r>
+      <w:r>
+        <w:rPr>
           <w:rFonts w:ascii="Consolas" w:hAnsi="Consolas"/>
           <w:sz w:val="21"/>
         </w:rPr>
-        <w:t>226ae26</w:t>
+        <w:t>ca2de3d</w:t>
       </w:r>
       <w:r>
         <w:rPr>
@@ -1874,7 +1926,7 @@
           <w:rFonts w:ascii="Consolas" w:hAnsi="Consolas"/>
           <w:sz w:val="21"/>
         </w:rPr>
-        <w:t>226ae26</w:t>
+        <w:t>ca2de3d</w:t>
       </w:r>
       <w:r>
         <w:rPr>
@@ -2488,7 +2540,7 @@
           <w:rFonts w:ascii="Consolas" w:hAnsi="Consolas"/>
           <w:sz w:val="21"/>
         </w:rPr>
-        <w:t>226ae26</w:t>
+        <w:t>ca2de3d</w:t>
       </w:r>
       <w:r>
         <w:rPr>
@@ -4157,7 +4209,7 @@
           <w:b w:val="0"/>
           <w:sz w:val="21"/>
         </w:rPr>
-        <w:t>. Se sabe antes, no por la app:</w:t>
+        <w:t>. Se sabe antes:</w:t>
       </w:r>
     </w:p>
     <w:p>
@@ -4197,7 +4249,21 @@
           <w:b w:val="0"/>
           <w:sz w:val="21"/>
         </w:rPr>
-        <w:t xml:space="preserve">la pila**: se hace antes de E2). Si contesta </w:t>
+        <w:t>la pila</w:t>
+      </w:r>
+      <w:r>
+        <w:rPr>
+          <w:b/>
+          <w:sz w:val="21"/>
+        </w:rPr>
+        <w:t xml:space="preserve">: se hace antes de E2). La respuesta llega </w:t>
+      </w:r>
+      <w:r>
+        <w:rPr>
+          <w:b w:val="0"/>
+          <w:sz w:val="21"/>
+        </w:rPr>
+        <w:t xml:space="preserve">unos segundos despues**, no en el acto: </w:t>
       </w:r>
       <w:r>
         <w:rPr>
@@ -4211,7 +4277,7 @@
           <w:b w:val="0"/>
           <w:sz w:val="21"/>
         </w:rPr>
-        <w:t>, el cristal esta muerto y</w:t>
+        <w:t xml:space="preserve"> = cristal</w:t>
       </w:r>
     </w:p>
     <w:p>
@@ -4223,7 +4289,7 @@
           <w:b w:val="0"/>
           <w:sz w:val="21"/>
         </w:rPr>
-        <w:t xml:space="preserve">esta prueba </w:t>
+        <w:t xml:space="preserve">muerto, esta prueba </w:t>
       </w:r>
       <w:r>
         <w:rPr>
@@ -4237,21 +4303,42 @@
           <w:b w:val="0"/>
           <w:sz w:val="21"/>
         </w:rPr>
-        <w:t xml:space="preserve"> a esa tarjeta. </w:t>
+        <w:t xml:space="preserve">; </w:t>
+      </w:r>
+      <w:r>
+        <w:rPr>
+          <w:rFonts w:ascii="Consolas" w:hAnsi="Consolas"/>
+          <w:sz w:val="21"/>
+        </w:rPr>
+        <w:t>ARRANCA_Y_NO_CUENTA_VEA_CONSULTA_RELOJ</w:t>
+      </w:r>
+      <w:r>
+        <w:rPr>
+          <w:b w:val="0"/>
+          <w:sz w:val="21"/>
+        </w:rPr>
+        <w:t xml:space="preserve"> = </w:t>
       </w:r>
       <w:r>
         <w:rPr>
           <w:b/>
           <w:sz w:val="21"/>
         </w:rPr>
-        <w:t>`CRISTAL_OK_PONGA_LA_HORA` no prueba que cuente</w:t>
-      </w:r>
-      <w:r>
-        <w:rPr>
-          <w:b w:val="0"/>
-          <w:sz w:val="21"/>
-        </w:rPr>
-        <w:t>: sale igual</w:t>
+        <w:t>congelado</w:t>
+      </w:r>
+      <w:r>
+        <w:rPr>
+          <w:b w:val="0"/>
+          <w:sz w:val="21"/>
+        </w:rPr>
+        <w:t xml:space="preserve">; </w:t>
+      </w:r>
+      <w:r>
+        <w:rPr>
+          <w:rFonts w:ascii="Consolas" w:hAnsi="Consolas"/>
+          <w:sz w:val="21"/>
+        </w:rPr>
+        <w:t>CRISTAL_OK_PONGA_LA_HORA</w:t>
       </w:r>
     </w:p>
     <w:p>
@@ -4263,7 +4350,47 @@
           <w:b w:val="0"/>
           <w:sz w:val="21"/>
         </w:rPr>
-        <w:t>con un cristal congelado. El Esclavo no tiene esta orden.</w:t>
+        <w:t xml:space="preserve">= cuenta (desde </w:t>
+      </w:r>
+      <w:r>
+        <w:rPr>
+          <w:rFonts w:ascii="Consolas" w:hAnsi="Consolas"/>
+          <w:sz w:val="21"/>
+        </w:rPr>
+        <w:t>ca2de3d</w:t>
+      </w:r>
+      <w:r>
+        <w:rPr>
+          <w:b w:val="0"/>
+          <w:sz w:val="21"/>
+        </w:rPr>
+        <w:t xml:space="preserve"> ya no sale con el cristal congelado). Si contesta </w:t>
+      </w:r>
+      <w:r>
+        <w:rPr>
+          <w:rFonts w:ascii="Consolas" w:hAnsi="Consolas"/>
+          <w:sz w:val="21"/>
+        </w:rPr>
+        <w:t>REPITA_EN_UNOS_SEGUNDOS</w:t>
+      </w:r>
+      <w:r>
+        <w:rPr>
+          <w:b w:val="0"/>
+          <w:sz w:val="21"/>
+        </w:rPr>
+        <w:t>, se</w:t>
+      </w:r>
+    </w:p>
+    <w:p>
+      <w:pPr>
+        <w:spacing w:after="120"/>
+      </w:pPr>
+      <w:r>
+        <w:rPr>
+          <w:b w:val="0"/>
+          <w:sz w:val="21"/>
+        </w:rPr>
+        <w:t>espera y se pide otra vez. El Esclavo no tiene esta orden.</w:t>
       </w:r>
     </w:p>
     <w:p>
@@ -4277,66 +4404,7 @@
           <w:b w:val="0"/>
           <w:sz w:val="21"/>
         </w:rPr>
-        <w:t xml:space="preserve">Para distinguir congelado de vivo, en las dos tarjetas: leer por SWD el contador </w:t>
-      </w:r>
-      <w:r>
-        <w:rPr>
-          <w:rFonts w:ascii="Consolas" w:hAnsi="Consolas"/>
-          <w:sz w:val="21"/>
-        </w:rPr>
-        <w:t>RTC_CNTL</w:t>
-      </w:r>
-    </w:p>
-    <w:p>
-      <w:pPr>
-        <w:spacing w:after="120"/>
-      </w:pPr>
-      <w:r>
-        <w:rPr>
-          <w:b w:val="0"/>
-          <w:sz w:val="21"/>
-        </w:rPr>
-        <w:t>(</w:t>
-      </w:r>
-      <w:r>
-        <w:rPr>
-          <w:rFonts w:ascii="Consolas" w:hAnsi="Consolas"/>
-          <w:sz w:val="21"/>
-        </w:rPr>
-        <w:t>0x4000281C</w:t>
-      </w:r>
-      <w:r>
-        <w:rPr>
-          <w:b w:val="0"/>
-          <w:sz w:val="21"/>
-        </w:rPr>
-        <w:t>) dos veces con 10 s de diferencia. Mismo valor = congelado; unos 10 mas = vivo. **SIN</w:t>
-      </w:r>
-    </w:p>
-    <w:p>
-      <w:pPr>
-        <w:spacing w:after="120"/>
-      </w:pPr>
-      <w:r>
-        <w:rPr>
-          <w:b w:val="0"/>
-          <w:sz w:val="21"/>
-        </w:rPr>
-        <w:t>VERIFICAR</w:t>
-      </w:r>
-      <w:r>
-        <w:rPr>
-          <w:b/>
-          <w:sz w:val="21"/>
-        </w:rPr>
-        <w:t xml:space="preserve"> que se pueda leer asi. Si no se puede, la prueba D es </w:t>
-      </w:r>
-      <w:r>
-        <w:rPr>
-          <w:b w:val="0"/>
-          <w:sz w:val="21"/>
-        </w:rPr>
-        <w:t>NO HECHO**: no se deduce.</w:t>
+        <w:t>Respuesta del poste 1: ______</w:t>
       </w:r>
     </w:p>
     <w:p>
@@ -4350,6 +4418,79 @@
           <w:b w:val="0"/>
           <w:sz w:val="21"/>
         </w:rPr>
+        <w:t xml:space="preserve">Para distinguir congelado de vivo, en las dos tarjetas: leer por SWD el contador </w:t>
+      </w:r>
+      <w:r>
+        <w:rPr>
+          <w:rFonts w:ascii="Consolas" w:hAnsi="Consolas"/>
+          <w:sz w:val="21"/>
+        </w:rPr>
+        <w:t>RTC_CNTL</w:t>
+      </w:r>
+    </w:p>
+    <w:p>
+      <w:pPr>
+        <w:spacing w:after="120"/>
+      </w:pPr>
+      <w:r>
+        <w:rPr>
+          <w:b w:val="0"/>
+          <w:sz w:val="21"/>
+        </w:rPr>
+        <w:t>(</w:t>
+      </w:r>
+      <w:r>
+        <w:rPr>
+          <w:rFonts w:ascii="Consolas" w:hAnsi="Consolas"/>
+          <w:sz w:val="21"/>
+        </w:rPr>
+        <w:t>0x4000281C</w:t>
+      </w:r>
+      <w:r>
+        <w:rPr>
+          <w:b w:val="0"/>
+          <w:sz w:val="21"/>
+        </w:rPr>
+        <w:t>) dos veces con 10 s de diferencia. Mismo valor = congelado; unos 10 mas = vivo. **SIN</w:t>
+      </w:r>
+    </w:p>
+    <w:p>
+      <w:pPr>
+        <w:spacing w:after="120"/>
+      </w:pPr>
+      <w:r>
+        <w:rPr>
+          <w:b w:val="0"/>
+          <w:sz w:val="21"/>
+        </w:rPr>
+        <w:t>VERIFICAR</w:t>
+      </w:r>
+      <w:r>
+        <w:rPr>
+          <w:b/>
+          <w:sz w:val="21"/>
+        </w:rPr>
+        <w:t xml:space="preserve"> que se pueda leer asi. Si no se puede, la prueba D es </w:t>
+      </w:r>
+      <w:r>
+        <w:rPr>
+          <w:b w:val="0"/>
+          <w:sz w:val="21"/>
+        </w:rPr>
+        <w:t>NO HECHO**: no se deduce.</w:t>
+      </w:r>
+    </w:p>
+    <w:p>
+      <w:pPr>
+        <w:pStyle w:val="ListBullet"/>
+        <w:spacing w:after="60"/>
+        <w:ind w:left="720"/>
+      </w:pPr>
+      <w:r>
+        <w:rPr>
+          <w:b w:val="0"/>
+          <w:sz w:val="21"/>
+        </w:rPr>
         <w:t>Estado del cristal: poste 1 ______ · poste 2 ______</w:t>
       </w:r>
     </w:p>
@@ -4477,7 +4618,7 @@
           <w:rFonts w:ascii="Consolas" w:hAnsi="Consolas"/>
           <w:sz w:val="21"/>
         </w:rPr>
-        <w:t>226ae26</w:t>
+        <w:t>ca2de3d</w:t>
       </w:r>
       <w:r>
         <w:rPr>
@@ -4498,7 +4639,54 @@
           <w:b w:val="0"/>
           <w:sz w:val="21"/>
         </w:rPr>
-        <w:t xml:space="preserve">. Con cristal </w:t>
+        <w:t>. Si el Maestro llega a caer a ambar por esto, debe salir</w:t>
+      </w:r>
+    </w:p>
+    <w:p>
+      <w:pPr>
+        <w:spacing w:after="120"/>
+      </w:pPr>
+      <w:r>
+        <w:rPr>
+          <w:rFonts w:ascii="Consolas" w:hAnsi="Consolas"/>
+          <w:sz w:val="21"/>
+        </w:rPr>
+        <w:t>$ALARM DEGRADADO</w:t>
+      </w:r>
+      <w:r>
+        <w:rPr>
+          <w:b w:val="0"/>
+          <w:sz w:val="21"/>
+        </w:rPr>
+        <w:t xml:space="preserve"> con causa </w:t>
+      </w:r>
+      <w:r>
+        <w:rPr>
+          <w:rFonts w:ascii="Consolas" w:hAnsi="Consolas"/>
+          <w:sz w:val="21"/>
+        </w:rPr>
+        <w:t>RELOJ_NO_CUENTA</w:t>
+      </w:r>
+      <w:r>
+        <w:rPr>
+          <w:b w:val="0"/>
+          <w:sz w:val="21"/>
+        </w:rPr>
+        <w:t xml:space="preserve"> (o </w:t>
+      </w:r>
+      <w:r>
+        <w:rPr>
+          <w:rFonts w:ascii="Consolas" w:hAnsi="Consolas"/>
+          <w:sz w:val="21"/>
+        </w:rPr>
+        <w:t>SYNC_SIN_FECHA</w:t>
+      </w:r>
+      <w:r>
+        <w:rPr>
+          <w:b w:val="0"/>
+          <w:sz w:val="21"/>
+        </w:rPr>
+        <w:t xml:space="preserve">), nunca mudo. Con cristal </w:t>
       </w:r>
       <w:r>
         <w:rPr>
@@ -6156,7 +6344,7 @@
           <w:rFonts w:ascii="Consolas" w:hAnsi="Consolas"/>
           <w:sz w:val="21"/>
         </w:rPr>
-        <w:t>Banco_226ae26_&lt;fecha de la sesion&gt;</w:t>
+        <w:t>Banco_ca2de3d_&lt;fecha de la sesion&gt;</w:t>
       </w:r>
       <w:r>
         <w:rPr>

</xml_diff>

<commit_message>
docs(E5): el paquete al funcional lleva FUENTE y APK, no .bin
El responsable fija que se entrega: firmware fuente para PlatformIO, las spec y
la solicitud en Word, la guia de conexiones y la APK; sin binarios, sin .md y sin
acta. El encargo y el LEEME lo dicen y explican que hacer si el sha256 del
binario compilado por el funcional no coincide con el nuestro (otro compilador,
otro binario del mismo fuente): anotar el que se cargue, o pedirnos el .bin.
Retira: la frase que decia que los .bin iban dentro.

Co-Authored-By: Claude Opus 5 (1M context) <noreply@anthropic.com>
</commit_message>
<xml_diff>
--- a/05_Funcional/ENCARGO_BANCO_15-09.docx
+++ b/05_Funcional/ENCARGO_BANCO_15-09.docx
@@ -1120,6 +1120,155 @@
     </w:p>
     <w:p>
       <w:pPr>
+        <w:spacing w:after="120"/>
+      </w:pPr>
+      <w:r>
+        <w:rPr>
+          <w:b w:val="0"/>
+          <w:sz w:val="21"/>
+        </w:rPr>
+        <w:t xml:space="preserve">🔴 </w:t>
+      </w:r>
+      <w:r>
+        <w:rPr>
+          <w:b/>
+          <w:sz w:val="21"/>
+        </w:rPr>
+        <w:t>LOS `.bin` NO VAN EN EL PAQUETE: van el FUENTE y la APK.</w:t>
+      </w:r>
+      <w:r>
+        <w:rPr>
+          <w:b w:val="0"/>
+          <w:sz w:val="21"/>
+        </w:rPr>
+        <w:t xml:space="preserve"> Se compilan con PlatformIO desde</w:t>
+      </w:r>
+    </w:p>
+    <w:p>
+      <w:pPr>
+        <w:spacing w:after="120"/>
+      </w:pPr>
+      <w:r>
+        <w:rPr>
+          <w:rFonts w:ascii="Consolas" w:hAnsi="Consolas"/>
+          <w:sz w:val="21"/>
+        </w:rPr>
+        <w:t>01_Firmware_PlatformIO/{Maestro,Esclavo,ESP32_Expansion}</w:t>
+      </w:r>
+      <w:r>
+        <w:rPr>
+          <w:b w:val="0"/>
+          <w:sz w:val="21"/>
+        </w:rPr>
+        <w:t xml:space="preserve"> —</w:t>
+      </w:r>
+      <w:r>
+        <w:rPr>
+          <w:rFonts w:ascii="Consolas" w:hAnsi="Consolas"/>
+          <w:sz w:val="21"/>
+        </w:rPr>
+        <w:t>pio run</w:t>
+      </w:r>
+      <w:r>
+        <w:rPr>
+          <w:b w:val="0"/>
+          <w:sz w:val="21"/>
+        </w:rPr>
+        <w:t xml:space="preserve">— y el </w:t>
+      </w:r>
+      <w:r>
+        <w:rPr>
+          <w:rFonts w:ascii="Consolas" w:hAnsi="Consolas"/>
+          <w:sz w:val="21"/>
+        </w:rPr>
+        <w:t>.bin</w:t>
+      </w:r>
+      <w:r>
+        <w:rPr>
+          <w:b w:val="0"/>
+          <w:sz w:val="21"/>
+        </w:rPr>
+        <w:t xml:space="preserve"> sale en</w:t>
+      </w:r>
+    </w:p>
+    <w:p>
+      <w:pPr>
+        <w:spacing w:after="120"/>
+      </w:pPr>
+      <w:r>
+        <w:rPr>
+          <w:rFonts w:ascii="Consolas" w:hAnsi="Consolas"/>
+          <w:sz w:val="21"/>
+        </w:rPr>
+        <w:t>.pio/build/&lt;entorno&gt;/firmware.bin</w:t>
+      </w:r>
+      <w:r>
+        <w:rPr>
+          <w:b w:val="0"/>
+          <w:sz w:val="21"/>
+        </w:rPr>
+        <w:t>. Los sha256 de arriba son los de ESTA maquina: si los tuyos no coinciden,</w:t>
+      </w:r>
+    </w:p>
+    <w:p>
+      <w:pPr>
+        <w:spacing w:after="120"/>
+      </w:pPr>
+      <w:r>
+        <w:rPr>
+          <w:b/>
+          <w:sz w:val="21"/>
+        </w:rPr>
+        <w:t>no es un fallo tuyo</w:t>
+      </w:r>
+      <w:r>
+        <w:rPr>
+          <w:b w:val="0"/>
+          <w:sz w:val="21"/>
+        </w:rPr>
+        <w:t xml:space="preserve"> —otra version del compilador da otro binario del mismo fuente—, pero entonces **anota</w:t>
+      </w:r>
+    </w:p>
+    <w:p>
+      <w:pPr>
+        <w:spacing w:after="120"/>
+      </w:pPr>
+      <w:r>
+        <w:rPr>
+          <w:b w:val="0"/>
+          <w:sz w:val="21"/>
+        </w:rPr>
+        <w:t xml:space="preserve">el sha256 de lo que cargaste** y pidenos el </w:t>
+      </w:r>
+      <w:r>
+        <w:rPr>
+          <w:rFonts w:ascii="Consolas" w:hAnsi="Consolas"/>
+          <w:sz w:val="21"/>
+        </w:rPr>
+        <w:t>.bin</w:t>
+      </w:r>
+      <w:r>
+        <w:rPr>
+          <w:b w:val="0"/>
+          <w:sz w:val="21"/>
+        </w:rPr>
+        <w:t xml:space="preserve"> si quieres cargar exactamente el mismo. Lo que no vale es</w:t>
+      </w:r>
+    </w:p>
+    <w:p>
+      <w:pPr>
+        <w:spacing w:after="120"/>
+      </w:pPr>
+      <w:r>
+        <w:rPr>
+          <w:b w:val="0"/>
+          <w:sz w:val="21"/>
+        </w:rPr>
+        <w:t>cargar sin anotar que se cargo.</w:t>
+      </w:r>
+    </w:p>
+    <w:p>
+      <w:pPr>
         <w:pStyle w:val="ListBullet"/>
         <w:spacing w:after="60"/>
         <w:ind w:left="360"/>
@@ -1143,7 +1292,40 @@
           <w:b w:val="0"/>
           <w:sz w:val="21"/>
         </w:rPr>
-        <w:t>.</w:t>
+        <w:t xml:space="preserve"> — dentro: el LEEME y esta solicitud en Word, las</w:t>
+      </w:r>
+    </w:p>
+    <w:p>
+      <w:pPr>
+        <w:spacing w:after="120"/>
+      </w:pPr>
+      <w:r>
+        <w:rPr>
+          <w:b w:val="0"/>
+          <w:sz w:val="21"/>
+        </w:rPr>
+        <w:t xml:space="preserve">nueve SPEC en Word, la guia de conexiones en </w:t>
+      </w:r>
+      <w:r>
+        <w:rPr>
+          <w:rFonts w:ascii="Consolas" w:hAnsi="Consolas"/>
+          <w:sz w:val="21"/>
+        </w:rPr>
+        <w:t>.html</w:t>
+      </w:r>
+      <w:r>
+        <w:rPr>
+          <w:b w:val="0"/>
+          <w:sz w:val="21"/>
+        </w:rPr>
+        <w:t xml:space="preserve">, la APK y el fuente para PlatformIO. </w:t>
+      </w:r>
+      <w:r>
+        <w:rPr>
+          <w:b/>
+          <w:sz w:val="21"/>
+        </w:rPr>
+        <w:t>Sin `.bin`.</w:t>
       </w:r>
     </w:p>
     <w:p>

</xml_diff>